<commit_message>
Update report on the security audit (aikido)
</commit_message>
<xml_diff>
--- a/documentation/Meow-Mentor_Project Report.docx
+++ b/documentation/Meow-Mentor_Project Report.docx
@@ -322,9 +322,11 @@
             <w:tcW w:w="6860" w:type="dxa"/>
           </w:tcPr>
           <w:p>
+            <w:proofErr w:type="spellStart"/>
             <w:r>
               <w:t>Streamlit</w:t>
             </w:r>
+            <w:proofErr w:type="spellEnd"/>
           </w:p>
         </w:tc>
       </w:tr>
@@ -345,7 +347,15 @@
           </w:tcPr>
           <w:p>
             <w:r>
-              <w:t>Google Gemini 2.5 Flash (via google-genai SDK), function calling / tool use</w:t>
+              <w:t>Google Gemini 2.5 Flash (via google-</w:t>
+            </w:r>
+            <w:proofErr w:type="spellStart"/>
+            <w:r>
+              <w:t>genai</w:t>
+            </w:r>
+            <w:proofErr w:type="spellEnd"/>
+            <w:r>
+              <w:t xml:space="preserve"> SDK), function calling / tool use</w:t>
             </w:r>
           </w:p>
         </w:tc>
@@ -431,7 +441,15 @@
         <w:spacing w:after="120"/>
       </w:pPr>
       <w:r>
-        <w:t>Meow-Mentor is a single-page Streamlit application that communicates with Google Gemini 2.5 Flash using function calling (tool use). The flow is as follows:</w:t>
+        <w:t xml:space="preserve">Meow-Mentor is a single-page </w:t>
+      </w:r>
+      <w:proofErr w:type="spellStart"/>
+      <w:r>
+        <w:t>Streamlit</w:t>
+      </w:r>
+      <w:proofErr w:type="spellEnd"/>
+      <w:r>
+        <w:t xml:space="preserve"> application that communicates with Google Gemini 2.5 Flash using function calling (tool use). The flow is as follows:</w:t>
       </w:r>
     </w:p>
     <w:p>
@@ -444,7 +462,115 @@
           <w:sz w:val="18"/>
           <w:szCs w:val="18"/>
         </w:rPr>
-        <w:t>User input (text + optional photo)         │         ▼ Gemini 2.5 Flash (system-instructed agent)         │         ├─ Detects location mention → calls cari_shelter_berdekatan()         ├─ Detects symptom/injury mention → calls nilai_tahap_urgensi()         │         ▼ Tool results fed back to Gemini         │         ▼ Final natural-language response (bilingual)</w:t>
+        <w:t xml:space="preserve">User input (text + optional </w:t>
+      </w:r>
+      <w:proofErr w:type="gramStart"/>
+      <w:r>
+        <w:rPr>
+          <w:rFonts w:ascii="Courier New" w:eastAsia="Courier New" w:hAnsi="Courier New" w:cs="Courier New"/>
+          <w:sz w:val="18"/>
+          <w:szCs w:val="18"/>
+        </w:rPr>
+        <w:t xml:space="preserve">photo)   </w:t>
+      </w:r>
+      <w:proofErr w:type="gramEnd"/>
+      <w:r>
+        <w:rPr>
+          <w:rFonts w:ascii="Courier New" w:eastAsia="Courier New" w:hAnsi="Courier New" w:cs="Courier New"/>
+          <w:sz w:val="18"/>
+          <w:szCs w:val="18"/>
+        </w:rPr>
+        <w:t xml:space="preserve">      │         ▼ Gemini 2.5 Flash (system-instructed </w:t>
+      </w:r>
+      <w:proofErr w:type="gramStart"/>
+      <w:r>
+        <w:rPr>
+          <w:rFonts w:ascii="Courier New" w:eastAsia="Courier New" w:hAnsi="Courier New" w:cs="Courier New"/>
+          <w:sz w:val="18"/>
+          <w:szCs w:val="18"/>
+        </w:rPr>
+        <w:t xml:space="preserve">agent)   </w:t>
+      </w:r>
+      <w:proofErr w:type="gramEnd"/>
+      <w:r>
+        <w:rPr>
+          <w:rFonts w:ascii="Courier New" w:eastAsia="Courier New" w:hAnsi="Courier New" w:cs="Courier New"/>
+          <w:sz w:val="18"/>
+          <w:szCs w:val="18"/>
+        </w:rPr>
+        <w:t xml:space="preserve">      │         ├─ Detects location mention → calls </w:t>
+      </w:r>
+      <w:proofErr w:type="spellStart"/>
+      <w:r>
+        <w:rPr>
+          <w:rFonts w:ascii="Courier New" w:eastAsia="Courier New" w:hAnsi="Courier New" w:cs="Courier New"/>
+          <w:sz w:val="18"/>
+          <w:szCs w:val="18"/>
+        </w:rPr>
+        <w:t>cari_shelter_</w:t>
+      </w:r>
+      <w:proofErr w:type="gramStart"/>
+      <w:r>
+        <w:rPr>
+          <w:rFonts w:ascii="Courier New" w:eastAsia="Courier New" w:hAnsi="Courier New" w:cs="Courier New"/>
+          <w:sz w:val="18"/>
+          <w:szCs w:val="18"/>
+        </w:rPr>
+        <w:t>berdekatan</w:t>
+      </w:r>
+      <w:proofErr w:type="spellEnd"/>
+      <w:r>
+        <w:rPr>
+          <w:rFonts w:ascii="Courier New" w:eastAsia="Courier New" w:hAnsi="Courier New" w:cs="Courier New"/>
+          <w:sz w:val="18"/>
+          <w:szCs w:val="18"/>
+        </w:rPr>
+        <w:t>(</w:t>
+      </w:r>
+      <w:proofErr w:type="gramEnd"/>
+      <w:r>
+        <w:rPr>
+          <w:rFonts w:ascii="Courier New" w:eastAsia="Courier New" w:hAnsi="Courier New" w:cs="Courier New"/>
+          <w:sz w:val="18"/>
+          <w:szCs w:val="18"/>
+        </w:rPr>
+        <w:t xml:space="preserve">)         ├─ Detects symptom/injury mention → calls </w:t>
+      </w:r>
+      <w:proofErr w:type="spellStart"/>
+      <w:r>
+        <w:rPr>
+          <w:rFonts w:ascii="Courier New" w:eastAsia="Courier New" w:hAnsi="Courier New" w:cs="Courier New"/>
+          <w:sz w:val="18"/>
+          <w:szCs w:val="18"/>
+        </w:rPr>
+        <w:t>nilai_tahap_</w:t>
+      </w:r>
+      <w:proofErr w:type="gramStart"/>
+      <w:r>
+        <w:rPr>
+          <w:rFonts w:ascii="Courier New" w:eastAsia="Courier New" w:hAnsi="Courier New" w:cs="Courier New"/>
+          <w:sz w:val="18"/>
+          <w:szCs w:val="18"/>
+        </w:rPr>
+        <w:t>urgensi</w:t>
+      </w:r>
+      <w:proofErr w:type="spellEnd"/>
+      <w:r>
+        <w:rPr>
+          <w:rFonts w:ascii="Courier New" w:eastAsia="Courier New" w:hAnsi="Courier New" w:cs="Courier New"/>
+          <w:sz w:val="18"/>
+          <w:szCs w:val="18"/>
+        </w:rPr>
+        <w:t>(</w:t>
+      </w:r>
+      <w:proofErr w:type="gramEnd"/>
+      <w:r>
+        <w:rPr>
+          <w:rFonts w:ascii="Courier New" w:eastAsia="Courier New" w:hAnsi="Courier New" w:cs="Courier New"/>
+          <w:sz w:val="18"/>
+          <w:szCs w:val="18"/>
+        </w:rPr>
+        <w:t>)         │         ▼ Tool results fed back to Gemini         │         ▼ Final natural-language response (bilingual)</w:t>
       </w:r>
     </w:p>
     <w:p>
@@ -452,7 +578,15 @@
         <w:spacing w:after="120"/>
       </w:pPr>
       <w:r>
-        <w:t>A key architectural decision was disabling Gemini's Automatic Function Calling (AFC) and handling tool execution manually. In automatic mode, Gemini resolves and executes tool calls internally before the application code has a chance to inject the user's selected language into the function arguments — this silently broke bilingual consistency during development. Manual control guarantees the bahasa (language) parameter is always correctly passed through to each tool call, and allows multiple tool calls triggered in a single turn (e.g. both a location and a symptom mentioned together) to be batched and resolved correctly in one round-trip rather than causing mismatched conversation history.</w:t>
+        <w:t xml:space="preserve">A key architectural decision was disabling Gemini's Automatic Function Calling (AFC) and handling tool execution manually. In automatic mode, Gemini resolves and executes tool calls internally before the application code has a chance to inject the user's selected language into the function arguments — this silently broke bilingual consistency during development. Manual control guarantees the </w:t>
+      </w:r>
+      <w:proofErr w:type="spellStart"/>
+      <w:r>
+        <w:t>bahasa</w:t>
+      </w:r>
+      <w:proofErr w:type="spellEnd"/>
+      <w:r>
+        <w:t xml:space="preserve"> (language) parameter is always correctly passed through to each tool call, and allows multiple tool calls triggered in a single turn (e.g. both a location and a symptom mentioned together) to be batched and resolved correctly in one round-trip rather than causing mismatched conversation history.</w:t>
       </w:r>
     </w:p>
     <w:p>
@@ -590,7 +724,39 @@
           </w:tcPr>
           <w:p>
             <w:r>
-              <w:t>Set language to Malay. Type: "kucing sakit dekat shah alam"</w:t>
+              <w:t>Set language to Malay. Type: "</w:t>
+            </w:r>
+            <w:proofErr w:type="spellStart"/>
+            <w:r>
+              <w:t>kucing</w:t>
+            </w:r>
+            <w:proofErr w:type="spellEnd"/>
+            <w:r>
+              <w:t xml:space="preserve"> </w:t>
+            </w:r>
+            <w:proofErr w:type="spellStart"/>
+            <w:r>
+              <w:t>sakit</w:t>
+            </w:r>
+            <w:proofErr w:type="spellEnd"/>
+            <w:r>
+              <w:t xml:space="preserve"> </w:t>
+            </w:r>
+            <w:proofErr w:type="spellStart"/>
+            <w:r>
+              <w:t>dekat</w:t>
+            </w:r>
+            <w:proofErr w:type="spellEnd"/>
+            <w:r>
+              <w:t xml:space="preserve"> shah </w:t>
+            </w:r>
+            <w:proofErr w:type="spellStart"/>
+            <w:r>
+              <w:t>alam</w:t>
+            </w:r>
+            <w:proofErr w:type="spellEnd"/>
+            <w:r>
+              <w:t>"</w:t>
             </w:r>
           </w:p>
         </w:tc>
@@ -600,7 +766,23 @@
           </w:tcPr>
           <w:p>
             <w:r>
-              <w:t>Agent auto-triggers both nilai_tahap_urgensi and cari_shelter_berdekatan; responds fully in Malay with STABIL assessment + shelter list</w:t>
+              <w:t xml:space="preserve">Agent auto-triggers both </w:t>
+            </w:r>
+            <w:proofErr w:type="spellStart"/>
+            <w:r>
+              <w:t>nilai_tahap_urgensi</w:t>
+            </w:r>
+            <w:proofErr w:type="spellEnd"/>
+            <w:r>
+              <w:t xml:space="preserve"> and </w:t>
+            </w:r>
+            <w:proofErr w:type="spellStart"/>
+            <w:r>
+              <w:t>cari_shelter_berdekatan</w:t>
+            </w:r>
+            <w:proofErr w:type="spellEnd"/>
+            <w:r>
+              <w:t>; responds fully in Malay with STABIL assessment + shelter list</w:t>
             </w:r>
           </w:p>
         </w:tc>
@@ -610,7 +792,31 @@
           </w:tcPr>
           <w:p>
             <w:r>
-              <w:t>Response correctly returned in Malay: "STABIL" + "Pusat Jagaan Meow", "Rumah Kucing Jalanan"</w:t>
+              <w:t xml:space="preserve">Response correctly returned in Malay: "STABIL" + "Pusat </w:t>
+            </w:r>
+            <w:proofErr w:type="spellStart"/>
+            <w:r>
+              <w:t>Jagaan</w:t>
+            </w:r>
+            <w:proofErr w:type="spellEnd"/>
+            <w:r>
+              <w:t xml:space="preserve"> Meow", "Rumah </w:t>
+            </w:r>
+            <w:proofErr w:type="spellStart"/>
+            <w:r>
+              <w:t>Kucing</w:t>
+            </w:r>
+            <w:proofErr w:type="spellEnd"/>
+            <w:r>
+              <w:t xml:space="preserve"> </w:t>
+            </w:r>
+            <w:proofErr w:type="spellStart"/>
+            <w:r>
+              <w:t>Jalanan</w:t>
+            </w:r>
+            <w:proofErr w:type="spellEnd"/>
+            <w:r>
+              <w:t>"</w:t>
             </w:r>
           </w:p>
         </w:tc>
@@ -642,7 +848,15 @@
           </w:tcPr>
           <w:p>
             <w:r>
-              <w:t>Set language to English. Type: "sick cat in shah alam"</w:t>
+              <w:t xml:space="preserve">Set language to English. Type: "sick cat in shah </w:t>
+            </w:r>
+            <w:proofErr w:type="spellStart"/>
+            <w:r>
+              <w:t>alam</w:t>
+            </w:r>
+            <w:proofErr w:type="spellEnd"/>
+            <w:r>
+              <w:t>"</w:t>
             </w:r>
           </w:p>
         </w:tc>
@@ -714,7 +928,23 @@
           </w:tcPr>
           <w:p>
             <w:r>
-              <w:t>Unified ‘Analyze Photo’ button appears, allowing the user to procedd with just the image.</w:t>
+              <w:t>Unified ‘</w:t>
+            </w:r>
+            <w:proofErr w:type="spellStart"/>
+            <w:r>
+              <w:t>Analyze</w:t>
+            </w:r>
+            <w:proofErr w:type="spellEnd"/>
+            <w:r>
+              <w:t xml:space="preserve"> Photo’ button appears, allowing the user to </w:t>
+            </w:r>
+            <w:proofErr w:type="spellStart"/>
+            <w:r>
+              <w:t>procedd</w:t>
+            </w:r>
+            <w:proofErr w:type="spellEnd"/>
+            <w:r>
+              <w:t xml:space="preserve"> with just the image.</w:t>
             </w:r>
           </w:p>
         </w:tc>
@@ -746,7 +976,15 @@
           </w:tcPr>
           <w:p>
             <w:r>
-              <w:t>After a photo has already been analyzed, upload the exact same file again</w:t>
+              <w:t xml:space="preserve">After a photo has already been </w:t>
+            </w:r>
+            <w:proofErr w:type="spellStart"/>
+            <w:r>
+              <w:t>analyzed</w:t>
+            </w:r>
+            <w:proofErr w:type="spellEnd"/>
+            <w:r>
+              <w:t>, upload the exact same file again</w:t>
             </w:r>
           </w:p>
         </w:tc>
@@ -766,8 +1004,21 @@
           </w:tcPr>
           <w:p>
             <w:r>
-              <w:t>Button correctly stayed hidden — file tracked via file_id/last_processed_file</w:t>
-            </w:r>
+              <w:t xml:space="preserve">Button correctly stayed hidden — file tracked via </w:t>
+            </w:r>
+            <w:proofErr w:type="spellStart"/>
+            <w:r>
+              <w:t>file_id</w:t>
+            </w:r>
+            <w:proofErr w:type="spellEnd"/>
+            <w:r>
+              <w:t>/</w:t>
+            </w:r>
+            <w:proofErr w:type="spellStart"/>
+            <w:r>
+              <w:t>last_processed_file</w:t>
+            </w:r>
+            <w:proofErr w:type="spellEnd"/>
           </w:p>
         </w:tc>
         <w:tc>
@@ -871,7 +1122,17 @@
           </w:tcPr>
           <w:p>
             <w:r>
-              <w:t>"Something went wrong: 503 UNAVAILABLE..." shown via st.error(); app remained usable after retry</w:t>
+              <w:t xml:space="preserve">"Something went wrong: 503 UNAVAILABLE..." shown via </w:t>
+            </w:r>
+            <w:proofErr w:type="spellStart"/>
+            <w:proofErr w:type="gramStart"/>
+            <w:r>
+              <w:t>st.error</w:t>
+            </w:r>
+            <w:proofErr w:type="spellEnd"/>
+            <w:proofErr w:type="gramEnd"/>
+            <w:r>
+              <w:t>(); app remained usable after retry</w:t>
             </w:r>
           </w:p>
         </w:tc>
@@ -923,7 +1184,23 @@
           </w:tcPr>
           <w:p>
             <w:r>
-              <w:t>Both nilai_tahap_urgensi and cari_shelter_berdekatan executed together; single combined response returned</w:t>
+              <w:t xml:space="preserve">Both </w:t>
+            </w:r>
+            <w:proofErr w:type="spellStart"/>
+            <w:r>
+              <w:t>nilai_tahap_urgensi</w:t>
+            </w:r>
+            <w:proofErr w:type="spellEnd"/>
+            <w:r>
+              <w:t xml:space="preserve"> and </w:t>
+            </w:r>
+            <w:proofErr w:type="spellStart"/>
+            <w:r>
+              <w:t>cari_shelter_berdekatan</w:t>
+            </w:r>
+            <w:proofErr w:type="spellEnd"/>
+            <w:r>
+              <w:t xml:space="preserve"> executed together; single combined response returned</w:t>
             </w:r>
           </w:p>
         </w:tc>
@@ -965,7 +1242,15 @@
           </w:tcPr>
           <w:p>
             <w:r>
-              <w:t>The bahasa parameter set by the user should be correctly passed into the tool call, not defaulted</w:t>
+              <w:t xml:space="preserve">The </w:t>
+            </w:r>
+            <w:proofErr w:type="spellStart"/>
+            <w:r>
+              <w:t>bahasa</w:t>
+            </w:r>
+            <w:proofErr w:type="spellEnd"/>
+            <w:r>
+              <w:t xml:space="preserve"> parameter set by the user should be correctly passed into the tool call, not defaulted</w:t>
             </w:r>
           </w:p>
         </w:tc>
@@ -991,6 +1276,101 @@
         </w:tc>
       </w:tr>
     </w:tbl>
+    <w:p>
+      <w:pPr>
+        <w:pStyle w:val="Heading1"/>
+        <w:spacing w:before="300" w:after="150"/>
+      </w:pPr>
+      <w:r>
+        <w:t>7. Security Audit (Aikido)</w:t>
+      </w:r>
+    </w:p>
+    <w:p>
+      <w:pPr>
+        <w:pStyle w:val="ListParagraph"/>
+      </w:pPr>
+      <w:r>
+        <w:t xml:space="preserve">Meow-Mentor was scanned using Aikido Security's automated code audit (SAST — Static Application Security Testing) to check for vulnerabilities, exposed secrets, and insecure dependencies. </w:t>
+      </w:r>
+    </w:p>
+    <w:p>
+      <w:pPr>
+        <w:pStyle w:val="ListParagraph"/>
+      </w:pPr>
+    </w:p>
+    <w:p>
+      <w:pPr>
+        <w:pStyle w:val="ListParagraph"/>
+      </w:pPr>
+      <w:r>
+        <w:t>Scan Result: 0 issues found (clean scan)</w:t>
+      </w:r>
+    </w:p>
+    <w:p>
+      <w:pPr>
+        <w:pStyle w:val="ListParagraph"/>
+      </w:pPr>
+    </w:p>
+    <w:p>
+      <w:pPr>
+        <w:pStyle w:val="ListParagraph"/>
+      </w:pPr>
+      <w:r>
+        <w:rPr>
+          <w:noProof/>
+        </w:rPr>
+        <w:drawing>
+          <wp:inline distT="0" distB="0" distL="0" distR="0" wp14:anchorId="721332A8" wp14:editId="25287AC0">
+            <wp:extent cx="5882640" cy="3070860"/>
+            <wp:effectExtent l="0" t="0" r="3810" b="0"/>
+            <wp:docPr id="241021120" name="Picture 1"/>
+            <wp:cNvGraphicFramePr>
+              <a:graphicFrameLocks xmlns:a="http://schemas.openxmlformats.org/drawingml/2006/main" noChangeAspect="1"/>
+            </wp:cNvGraphicFramePr>
+            <a:graphic xmlns:a="http://schemas.openxmlformats.org/drawingml/2006/main">
+              <a:graphicData uri="http://schemas.openxmlformats.org/drawingml/2006/picture">
+                <pic:pic xmlns:pic="http://schemas.openxmlformats.org/drawingml/2006/picture">
+                  <pic:nvPicPr>
+                    <pic:cNvPr id="241021120" name="Picture 241021120"/>
+                    <pic:cNvPicPr/>
+                  </pic:nvPicPr>
+                  <pic:blipFill rotWithShape="1">
+                    <a:blip r:embed="rId5" cstate="print">
+                      <a:extLst>
+                        <a:ext uri="{28A0092B-C50C-407E-A947-70E740481C1C}">
+                          <a14:useLocalDpi xmlns:a14="http://schemas.microsoft.com/office/drawing/2010/main" val="0"/>
+                        </a:ext>
+                      </a:extLst>
+                    </a:blip>
+                    <a:srcRect t="12308" r="1025" b="5025"/>
+                    <a:stretch>
+                      <a:fillRect/>
+                    </a:stretch>
+                  </pic:blipFill>
+                  <pic:spPr bwMode="auto">
+                    <a:xfrm>
+                      <a:off x="0" y="0"/>
+                      <a:ext cx="5882640" cy="3070860"/>
+                    </a:xfrm>
+                    <a:prstGeom prst="rect">
+                      <a:avLst/>
+                    </a:prstGeom>
+                    <a:ln>
+                      <a:noFill/>
+                    </a:ln>
+                    <a:extLst>
+                      <a:ext uri="{53640926-AAD7-44D8-BBD7-CCE9431645EC}">
+                        <a14:shadowObscured xmlns:a14="http://schemas.microsoft.com/office/drawing/2010/main"/>
+                      </a:ext>
+                    </a:extLst>
+                  </pic:spPr>
+                </pic:pic>
+              </a:graphicData>
+            </a:graphic>
+          </wp:inline>
+        </w:drawing>
+      </w:r>
+    </w:p>
     <w:p>
       <w:pPr>
         <w:pStyle w:val="Heading1"/>
@@ -1127,7 +1507,20 @@
         <w:spacing w:after="120"/>
       </w:pPr>
       <w:r>
-        <w:t>This project was an exercise in AI-assisted development rather than pure "vibe coding" — every bug fix and design decision was understood and verified before being accepted, rather than blindly copy-pasted. Key technical takeaways included understanding how Automatic Function Calling can silently interfere with manual parameter injection, the importance of restructuring multi-tool-call loops to batch responses correctly, and practical, hands-on exposure to concepts (function calling as a precursor to OOP-based agent design, API request/response patterns) ahead of formal coursework. On the non-technical side, the project reinforced the importance of git hygiene and identity management (commit author info, .gitignore discipline) when anonymity is a submission requirement.</w:t>
+        <w:t>This project was an exercise in AI-assisted development rather than pure "vibe coding" — every bug fix and design decision was understood and verified before being accepted, rather than blindly copy-pasted. Key technical takeaways included understanding how Automatic Function Calling can silently interfere with manual parameter injection, the importance of restructuring multi-tool-call loops to batch responses correctly, and practical, hands-on exposure to concepts (function calling as a precursor to OOP-based agent design, API request/response patterns) ahead of formal coursework. On the non-technical side, the project reinforced the importance of git hygiene and identity management (commit author info</w:t>
+      </w:r>
+      <w:proofErr w:type="gramStart"/>
+      <w:r>
+        <w:t>, .</w:t>
+      </w:r>
+      <w:proofErr w:type="spellStart"/>
+      <w:r>
+        <w:t>gitignore</w:t>
+      </w:r>
+      <w:proofErr w:type="spellEnd"/>
+      <w:proofErr w:type="gramEnd"/>
+      <w:r>
+        <w:t xml:space="preserve"> discipline) when anonymity is a submission requirement.</w:t>
       </w:r>
     </w:p>
     <w:p>
@@ -1144,7 +1537,23 @@
         <w:spacing w:after="120"/>
       </w:pPr>
       <w:r>
-        <w:t>Thanks to Google for the Gemini API, the Streamlit team for the framework this project is built on, and the HackTheKitty / Coding Kitty community for organizing this hackathon.</w:t>
+        <w:t xml:space="preserve">Thanks to Google for the Gemini API, the </w:t>
+      </w:r>
+      <w:proofErr w:type="spellStart"/>
+      <w:r>
+        <w:t>Streamlit</w:t>
+      </w:r>
+      <w:proofErr w:type="spellEnd"/>
+      <w:r>
+        <w:t xml:space="preserve"> team for the framework this project is built on, and the </w:t>
+      </w:r>
+      <w:proofErr w:type="spellStart"/>
+      <w:r>
+        <w:t>HackTheKitty</w:t>
+      </w:r>
+      <w:proofErr w:type="spellEnd"/>
+      <w:r>
+        <w:t xml:space="preserve"> / Coding Kitty community for organizing this hackathon.</w:t>
       </w:r>
     </w:p>
     <w:p>
@@ -1153,7 +1562,6 @@
         <w:spacing w:before="300" w:after="150"/>
       </w:pPr>
       <w:r>
-        <w:lastRenderedPageBreak/>
         <w:t>Submission Checklist</w:t>
       </w:r>
     </w:p>
@@ -1225,7 +1633,23 @@
         <w:spacing w:after="80"/>
       </w:pPr>
       <w:r>
-        <w:t>No unrelated files, executables, auto-generated code, or package folders (e.g. node_modules/, build/, dist/, vendor/)</w:t>
+        <w:t xml:space="preserve">No unrelated files, executables, auto-generated code, or package folders (e.g. </w:t>
+      </w:r>
+      <w:proofErr w:type="spellStart"/>
+      <w:r>
+        <w:t>node_modules</w:t>
+      </w:r>
+      <w:proofErr w:type="spellEnd"/>
+      <w:r>
+        <w:t xml:space="preserve">/, build/, </w:t>
+      </w:r>
+      <w:proofErr w:type="spellStart"/>
+      <w:r>
+        <w:t>dist</w:t>
+      </w:r>
+      <w:proofErr w:type="spellEnd"/>
+      <w:r>
+        <w:t>/, vendor/)</w:t>
       </w:r>
     </w:p>
     <w:sectPr>
@@ -1326,11 +1750,127 @@
       </w:pPr>
     </w:lvl>
   </w:abstractNum>
+  <w:abstractNum w:abstractNumId="1" w15:restartNumberingAfterBreak="0">
+    <w:nsid w:val="7CF46B02"/>
+    <w:multiLevelType w:val="hybridMultilevel"/>
+    <w:tmpl w:val="08E21DD4"/>
+    <w:lvl w:ilvl="0" w:tplc="44090001">
+      <w:start w:val="1"/>
+      <w:numFmt w:val="bullet"/>
+      <w:lvlText w:val=""/>
+      <w:lvlJc w:val="left"/>
+      <w:pPr>
+        <w:ind w:left="720" w:hanging="360"/>
+      </w:pPr>
+      <w:rPr>
+        <w:rFonts w:ascii="Symbol" w:hAnsi="Symbol" w:hint="default"/>
+      </w:rPr>
+    </w:lvl>
+    <w:lvl w:ilvl="1" w:tplc="44090003" w:tentative="1">
+      <w:start w:val="1"/>
+      <w:numFmt w:val="bullet"/>
+      <w:lvlText w:val="o"/>
+      <w:lvlJc w:val="left"/>
+      <w:pPr>
+        <w:ind w:left="1440" w:hanging="360"/>
+      </w:pPr>
+      <w:rPr>
+        <w:rFonts w:ascii="Courier New" w:hAnsi="Courier New" w:cs="Courier New" w:hint="default"/>
+      </w:rPr>
+    </w:lvl>
+    <w:lvl w:ilvl="2" w:tplc="44090005" w:tentative="1">
+      <w:start w:val="1"/>
+      <w:numFmt w:val="bullet"/>
+      <w:lvlText w:val=""/>
+      <w:lvlJc w:val="left"/>
+      <w:pPr>
+        <w:ind w:left="2160" w:hanging="360"/>
+      </w:pPr>
+      <w:rPr>
+        <w:rFonts w:ascii="Wingdings" w:hAnsi="Wingdings" w:hint="default"/>
+      </w:rPr>
+    </w:lvl>
+    <w:lvl w:ilvl="3" w:tplc="44090001" w:tentative="1">
+      <w:start w:val="1"/>
+      <w:numFmt w:val="bullet"/>
+      <w:lvlText w:val=""/>
+      <w:lvlJc w:val="left"/>
+      <w:pPr>
+        <w:ind w:left="2880" w:hanging="360"/>
+      </w:pPr>
+      <w:rPr>
+        <w:rFonts w:ascii="Symbol" w:hAnsi="Symbol" w:hint="default"/>
+      </w:rPr>
+    </w:lvl>
+    <w:lvl w:ilvl="4" w:tplc="44090003" w:tentative="1">
+      <w:start w:val="1"/>
+      <w:numFmt w:val="bullet"/>
+      <w:lvlText w:val="o"/>
+      <w:lvlJc w:val="left"/>
+      <w:pPr>
+        <w:ind w:left="3600" w:hanging="360"/>
+      </w:pPr>
+      <w:rPr>
+        <w:rFonts w:ascii="Courier New" w:hAnsi="Courier New" w:cs="Courier New" w:hint="default"/>
+      </w:rPr>
+    </w:lvl>
+    <w:lvl w:ilvl="5" w:tplc="44090005" w:tentative="1">
+      <w:start w:val="1"/>
+      <w:numFmt w:val="bullet"/>
+      <w:lvlText w:val=""/>
+      <w:lvlJc w:val="left"/>
+      <w:pPr>
+        <w:ind w:left="4320" w:hanging="360"/>
+      </w:pPr>
+      <w:rPr>
+        <w:rFonts w:ascii="Wingdings" w:hAnsi="Wingdings" w:hint="default"/>
+      </w:rPr>
+    </w:lvl>
+    <w:lvl w:ilvl="6" w:tplc="44090001" w:tentative="1">
+      <w:start w:val="1"/>
+      <w:numFmt w:val="bullet"/>
+      <w:lvlText w:val=""/>
+      <w:lvlJc w:val="left"/>
+      <w:pPr>
+        <w:ind w:left="5040" w:hanging="360"/>
+      </w:pPr>
+      <w:rPr>
+        <w:rFonts w:ascii="Symbol" w:hAnsi="Symbol" w:hint="default"/>
+      </w:rPr>
+    </w:lvl>
+    <w:lvl w:ilvl="7" w:tplc="44090003" w:tentative="1">
+      <w:start w:val="1"/>
+      <w:numFmt w:val="bullet"/>
+      <w:lvlText w:val="o"/>
+      <w:lvlJc w:val="left"/>
+      <w:pPr>
+        <w:ind w:left="5760" w:hanging="360"/>
+      </w:pPr>
+      <w:rPr>
+        <w:rFonts w:ascii="Courier New" w:hAnsi="Courier New" w:cs="Courier New" w:hint="default"/>
+      </w:rPr>
+    </w:lvl>
+    <w:lvl w:ilvl="8" w:tplc="44090005" w:tentative="1">
+      <w:start w:val="1"/>
+      <w:numFmt w:val="bullet"/>
+      <w:lvlText w:val=""/>
+      <w:lvlJc w:val="left"/>
+      <w:pPr>
+        <w:ind w:left="6480" w:hanging="360"/>
+      </w:pPr>
+      <w:rPr>
+        <w:rFonts w:ascii="Wingdings" w:hAnsi="Wingdings" w:hint="default"/>
+      </w:rPr>
+    </w:lvl>
+  </w:abstractNum>
   <w:num w:numId="1" w16cid:durableId="1239484678">
     <w:abstractNumId w:val="0"/>
     <w:lvlOverride w:ilvl="0">
       <w:startOverride w:val="1"/>
     </w:lvlOverride>
+  </w:num>
+  <w:num w:numId="2" w16cid:durableId="131951309">
+    <w:abstractNumId w:val="1"/>
   </w:num>
 </w:numbering>
 </file>
@@ -1814,7 +2354,6 @@
   <w:style w:type="character" w:default="1" w:styleId="DefaultParagraphFont">
     <w:name w:val="Default Paragraph Font"/>
     <w:uiPriority w:val="1"/>
-    <w:semiHidden/>
     <w:unhideWhenUsed/>
   </w:style>
   <w:style w:type="table" w:default="1" w:styleId="TableNormal">

</xml_diff>